<commit_message>
update: 게재 논문 등재 구분 SCI/KCI → SCIE/ESCI/KCI — Forest Science and Technology(2026)는 ESCI, 웹·CV 에 논문별 등재 태그
- xlsx Index 열: SCI→SCIE 5편, FST→ESCI (빈 등재구분 열 삭제); _sync_site.py 가 index 를 site.json 으로 전달
- 웹: 국제 그룹 라벨 "SCIE / ESCI", 카드·리스트에 SCIE/ESCI/KCI 배지(.pill-idx), 판정 isIntl = index 우선·IF/Q fallback
- CV: 안내문 "(SCIE / ESCI, then KCI; newest first)", DOI 뒤 "· SCIE · IF …" 태그; 기준선 갱신, PDF 는 make_pdf.ps1 -Publish
- CLAUDE.md: Index(SCIE/ESCI/KCI), Publications 10행; .gitignore 에 xlsx 백업·pys_old

Co-Authored-By: Claude Fable 5.1 <noreply@anthropic.com>
Claude-Session: https://claude.ai/code/session_01MJibP7okYEHiNJZjuaq1H6
</commit_message>
<xml_diff>
--- a/cv/Lee_Seunghyeon_CV_v12.docx
+++ b/cv/Lee_Seunghyeon_CV_v12.docx
@@ -643,7 +643,7 @@
           <w:color w:val="6F6F6F"/>
           <w:sz w:val="18"/>
         </w:rPr>
-        <w:t>APA 7th.  Name in bold = author; † = first author.  Impact Factor / quartile shown where available.  (SCI then KCI; newest first)</w:t>
+        <w:t>APA 7th.  Name in bold = author; † = first author.  Impact Factor / quartile shown where available.  (SCIE / ESCI, then KCI; newest first)</w:t>
       </w:r>
     </w:p>
     <w:p>
@@ -829,6 +829,16 @@
           <w:color w:val="1F4E3D"/>
           <w:sz w:val="18"/>
         </w:rPr>
+        <w:t xml:space="preserve">  · ESCI</w:t>
+      </w:r>
+      <w:r>
+        <w:rPr>
+          <w:rFonts w:ascii="Cambria" w:hAnsi="Cambria" w:cs="Cambria" w:eastAsia="Cambria"/>
+          <w:b w:val="0"/>
+          <w:i w:val="0"/>
+          <w:color w:val="1F4E3D"/>
+          <w:sz w:val="18"/>
+        </w:rPr>
         <w:t xml:space="preserve">  · IF 2.4, Q2 (2026)</w:t>
       </w:r>
     </w:p>
@@ -1035,6 +1045,16 @@
           <w:color w:val="1F4E3D"/>
           <w:sz w:val="18"/>
         </w:rPr>
+        <w:t xml:space="preserve">  · SCIE</w:t>
+      </w:r>
+      <w:r>
+        <w:rPr>
+          <w:rFonts w:ascii="Cambria" w:hAnsi="Cambria" w:cs="Cambria" w:eastAsia="Cambria"/>
+          <w:b w:val="0"/>
+          <w:i w:val="0"/>
+          <w:color w:val="1F4E3D"/>
+          <w:sz w:val="18"/>
+        </w:rPr>
         <w:t xml:space="preserve">  · IF 6.4, Q1 (2026)</w:t>
       </w:r>
     </w:p>
@@ -1271,6 +1291,16 @@
           <w:color w:val="1F4E3D"/>
           <w:sz w:val="18"/>
         </w:rPr>
+        <w:t xml:space="preserve">  · SCIE</w:t>
+      </w:r>
+      <w:r>
+        <w:rPr>
+          <w:rFonts w:ascii="Cambria" w:hAnsi="Cambria" w:cs="Cambria" w:eastAsia="Cambria"/>
+          <w:b w:val="0"/>
+          <w:i w:val="0"/>
+          <w:color w:val="1F4E3D"/>
+          <w:sz w:val="18"/>
+        </w:rPr>
         <w:t xml:space="preserve">  · IF 7.4, Q1 (2026)</w:t>
       </w:r>
     </w:p>
@@ -1537,6 +1567,16 @@
           <w:color w:val="1F4E3D"/>
           <w:sz w:val="18"/>
         </w:rPr>
+        <w:t xml:space="preserve">  · SCIE</w:t>
+      </w:r>
+      <w:r>
+        <w:rPr>
+          <w:rFonts w:ascii="Cambria" w:hAnsi="Cambria" w:cs="Cambria" w:eastAsia="Cambria"/>
+          <w:b w:val="0"/>
+          <w:i w:val="0"/>
+          <w:color w:val="1F4E3D"/>
+          <w:sz w:val="18"/>
+        </w:rPr>
         <w:t xml:space="preserve">  · IF 11.4, Q1 (2026)</w:t>
       </w:r>
     </w:p>
@@ -1703,6 +1743,16 @@
           <w:color w:val="1F4E3D"/>
           <w:sz w:val="18"/>
         </w:rPr>
+        <w:t xml:space="preserve">  · SCIE</w:t>
+      </w:r>
+      <w:r>
+        <w:rPr>
+          <w:rFonts w:ascii="Cambria" w:hAnsi="Cambria" w:cs="Cambria" w:eastAsia="Cambria"/>
+          <w:b w:val="0"/>
+          <w:i w:val="0"/>
+          <w:color w:val="1F4E3D"/>
+          <w:sz w:val="18"/>
+        </w:rPr>
         <w:t xml:space="preserve">  · IF 3.4, Q1 (2025)</w:t>
       </w:r>
     </w:p>
@@ -1889,6 +1939,16 @@
           <w:color w:val="1F4E3D"/>
           <w:sz w:val="18"/>
         </w:rPr>
+        <w:t xml:space="preserve">  · SCIE</w:t>
+      </w:r>
+      <w:r>
+        <w:rPr>
+          <w:rFonts w:ascii="Cambria" w:hAnsi="Cambria" w:cs="Cambria" w:eastAsia="Cambria"/>
+          <w:b w:val="0"/>
+          <w:i w:val="0"/>
+          <w:color w:val="1F4E3D"/>
+          <w:sz w:val="18"/>
+        </w:rPr>
         <w:t xml:space="preserve">  · IF 5.0, Q1 (2022)</w:t>
       </w:r>
     </w:p>
@@ -2047,6 +2107,16 @@
           <w:t xml:space="preserve">https://doi.org/10.13087/kosert.2026.29.2.21</w:t>
         </w:r>
       </w:hyperlink>
+      <w:r>
+        <w:rPr>
+          <w:rFonts w:ascii="Cambria" w:hAnsi="Cambria" w:cs="Cambria" w:eastAsia="Cambria"/>
+          <w:b w:val="0"/>
+          <w:i w:val="0"/>
+          <w:color w:val="1F4E3D"/>
+          <w:sz w:val="18"/>
+        </w:rPr>
+        <w:t xml:space="preserve">  · KCI</w:t>
+      </w:r>
     </w:p>
     <w:p>
       <w:pPr>
@@ -2243,6 +2313,16 @@
           <w:t xml:space="preserve">https://doi.org/10.13087/kosert.2026.29.2.41</w:t>
         </w:r>
       </w:hyperlink>
+      <w:r>
+        <w:rPr>
+          <w:rFonts w:ascii="Cambria" w:hAnsi="Cambria" w:cs="Cambria" w:eastAsia="Cambria"/>
+          <w:b w:val="0"/>
+          <w:i w:val="0"/>
+          <w:color w:val="1F4E3D"/>
+          <w:sz w:val="18"/>
+        </w:rPr>
+        <w:t xml:space="preserve">  · KCI</w:t>
+      </w:r>
     </w:p>
     <w:p>
       <w:pPr>
@@ -2429,6 +2509,16 @@
           <w:t xml:space="preserve">https://doi.org/10.13087/kosert.2025.28.6.95</w:t>
         </w:r>
       </w:hyperlink>
+      <w:r>
+        <w:rPr>
+          <w:rFonts w:ascii="Cambria" w:hAnsi="Cambria" w:cs="Cambria" w:eastAsia="Cambria"/>
+          <w:b w:val="0"/>
+          <w:i w:val="0"/>
+          <w:color w:val="1F4E3D"/>
+          <w:sz w:val="18"/>
+        </w:rPr>
+        <w:t xml:space="preserve">  · KCI</w:t>
+      </w:r>
     </w:p>
     <w:p>
       <w:pPr>
@@ -2715,6 +2805,16 @@
           <w:t xml:space="preserve">https://doi.org/10.13087/kosert.2024.27.2.55</w:t>
         </w:r>
       </w:hyperlink>
+      <w:r>
+        <w:rPr>
+          <w:rFonts w:ascii="Cambria" w:hAnsi="Cambria" w:cs="Cambria" w:eastAsia="Cambria"/>
+          <w:b w:val="0"/>
+          <w:i w:val="0"/>
+          <w:color w:val="1F4E3D"/>
+          <w:sz w:val="18"/>
+        </w:rPr>
+        <w:t xml:space="preserve">  · KCI</w:t>
+      </w:r>
     </w:p>
     <w:p>
       <w:pPr>

</xml_diff>

<commit_message>
add: 게재 논문 11번 — Kim, Lee, Shin & Song (2026) Global Ecology and Conservation 71, e04430 (SCIE, IF 3.7, Q1) 웹·CV 반영, 심사 중 목록에서 제거
- bib 원본·individual 추가 → merge, xlsx Publications No.11 (co, 2/4, 교신 송영근, 2026.09.18) + Under Review 3행으로
- site.json id 11 (표지·PDF·figure 9장 캡션), figures.json, citations.json; About 게재논문 11·심사중 3
- CV: 새 논문 1번, 번호 재부여, Under Review 안내문 수 시트에서 산출(하드코딩 제거), PDF 재생성(LibreOffice)
- 저널 약어 GEC → GECCO: 2025 논문 표지·PDF·figures 폴더 개명, README 매핑표(id 10·11 추가), .gitignore 에 _logs/

Co-Authored-By: Claude Fable 5.1 <noreply@anthropic.com>
Claude-Session: https://claude.ai/code/session_01MJibP7okYEHiNJZjuaq1H6
</commit_message>
<xml_diff>
--- a/cv/Lee_Seunghyeon_CV_v12.docx
+++ b/cv/Lee_Seunghyeon_CV_v12.docx
@@ -664,6 +664,26 @@
       <w:r>
         <w:rPr>
           <w:rFonts w:ascii="Cambria" w:hAnsi="Cambria" w:cs="Cambria" w:eastAsia="Cambria"/>
+          <w:b w:val="0"/>
+          <w:i w:val="0"/>
+          <w:color w:val="1A1A1A"/>
+          <w:sz w:val="20"/>
+        </w:rPr>
+        <w:t>Kim, Y.</w:t>
+      </w:r>
+      <w:r>
+        <w:rPr>
+          <w:rFonts w:ascii="Cambria" w:hAnsi="Cambria" w:cs="Cambria" w:eastAsia="Cambria"/>
+          <w:b w:val="0"/>
+          <w:i w:val="0"/>
+          <w:color w:val="1A1A1A"/>
+          <w:sz w:val="20"/>
+        </w:rPr>
+        <w:t xml:space="preserve">, </w:t>
+      </w:r>
+      <w:r>
+        <w:rPr>
+          <w:rFonts w:ascii="Cambria" w:hAnsi="Cambria" w:cs="Cambria" w:eastAsia="Cambria"/>
           <w:b/>
           <w:i w:val="0"/>
           <w:color w:val="1A1A1A"/>
@@ -674,8 +694,184 @@
       <w:r>
         <w:rPr>
           <w:rFonts w:ascii="Cambria" w:hAnsi="Cambria" w:cs="Cambria" w:eastAsia="Cambria"/>
+          <w:b w:val="0"/>
+          <w:i w:val="0"/>
+          <w:color w:val="1A1A1A"/>
+          <w:sz w:val="20"/>
+        </w:rPr>
+        <w:t xml:space="preserve">, </w:t>
+      </w:r>
+      <w:r>
+        <w:rPr>
+          <w:rFonts w:ascii="Cambria" w:hAnsi="Cambria" w:cs="Cambria" w:eastAsia="Cambria"/>
+          <w:b w:val="0"/>
+          <w:i w:val="0"/>
+          <w:color w:val="1A1A1A"/>
+          <w:sz w:val="20"/>
+        </w:rPr>
+        <w:t>Shin, W.</w:t>
+      </w:r>
+      <w:r>
+        <w:rPr>
+          <w:rFonts w:ascii="Cambria" w:hAnsi="Cambria" w:cs="Cambria" w:eastAsia="Cambria"/>
+          <w:b w:val="0"/>
+          <w:i w:val="0"/>
+          <w:color w:val="1A1A1A"/>
+          <w:sz w:val="20"/>
+        </w:rPr>
+        <w:t xml:space="preserve">, </w:t>
+      </w:r>
+      <w:r>
+        <w:rPr>
+          <w:rFonts w:ascii="Cambria" w:hAnsi="Cambria" w:cs="Cambria" w:eastAsia="Cambria"/>
+          <w:b w:val="0"/>
+          <w:i w:val="0"/>
+          <w:color w:val="1A1A1A"/>
+          <w:sz w:val="20"/>
+        </w:rPr>
+        <w:t xml:space="preserve">&amp; </w:t>
+      </w:r>
+      <w:r>
+        <w:rPr>
+          <w:rFonts w:ascii="Cambria" w:hAnsi="Cambria" w:cs="Cambria" w:eastAsia="Cambria"/>
+          <w:b w:val="0"/>
+          <w:i w:val="0"/>
+          <w:color w:val="1A1A1A"/>
+          <w:sz w:val="20"/>
+        </w:rPr>
+        <w:t>Song, Y.</w:t>
+      </w:r>
+      <w:r>
+        <w:rPr>
+          <w:rFonts w:ascii="Cambria" w:hAnsi="Cambria" w:cs="Cambria" w:eastAsia="Cambria"/>
+          <w:b w:val="0"/>
+          <w:i w:val="0"/>
+          <w:color w:val="1A1A1A"/>
+          <w:sz w:val="20"/>
+        </w:rPr>
+        <w:t xml:space="preserve"> (2026). </w:t>
+      </w:r>
+      <w:r>
+        <w:rPr>
+          <w:rFonts w:ascii="Cambria" w:hAnsi="Cambria" w:cs="Cambria" w:eastAsia="Cambria"/>
+          <w:b w:val="0"/>
+          <w:i w:val="0"/>
+          <w:color w:val="1A1A1A"/>
+          <w:sz w:val="20"/>
+        </w:rPr>
+        <w:t xml:space="preserve">Integrating unmanned aerial vehicle-derived habitat metrics with movement persistence and species distribution models to characterize seasonal habitat use of invasive turtles in urban wetlands. </w:t>
+      </w:r>
+      <w:r>
+        <w:rPr>
+          <w:rFonts w:ascii="Cambria" w:hAnsi="Cambria" w:cs="Cambria" w:eastAsia="Cambria"/>
+          <w:b w:val="0"/>
+          <w:i/>
+          <w:color w:val="1A1A1A"/>
+          <w:sz w:val="20"/>
+        </w:rPr>
+        <w:t>Global Ecology and Conservation</w:t>
+      </w:r>
+      <w:r>
+        <w:rPr>
+          <w:rFonts w:ascii="Cambria" w:hAnsi="Cambria" w:cs="Cambria" w:eastAsia="Cambria"/>
+          <w:b w:val="0"/>
+          <w:i w:val="0"/>
+          <w:color w:val="1A1A1A"/>
+          <w:sz w:val="20"/>
+        </w:rPr>
+        <w:t xml:space="preserve">, </w:t>
+      </w:r>
+      <w:r>
+        <w:rPr>
+          <w:rFonts w:ascii="Cambria" w:hAnsi="Cambria" w:cs="Cambria" w:eastAsia="Cambria"/>
+          <w:b w:val="0"/>
+          <w:i/>
+          <w:color w:val="1A1A1A"/>
+          <w:sz w:val="20"/>
+        </w:rPr>
+        <w:t>71</w:t>
+      </w:r>
+      <w:r>
+        <w:rPr>
+          <w:rFonts w:ascii="Cambria" w:hAnsi="Cambria" w:cs="Cambria" w:eastAsia="Cambria"/>
+          <w:b w:val="0"/>
+          <w:i w:val="0"/>
+          <w:color w:val="1A1A1A"/>
+          <w:sz w:val="20"/>
+        </w:rPr>
+        <w:t>, e04430</w:t>
+      </w:r>
+      <w:r>
+        <w:rPr>
+          <w:rFonts w:ascii="Cambria" w:hAnsi="Cambria" w:cs="Cambria" w:eastAsia="Cambria"/>
+          <w:b w:val="0"/>
+          <w:i w:val="0"/>
+          <w:color w:val="1A1A1A"/>
+          <w:sz w:val="20"/>
+        </w:rPr>
+        <w:t xml:space="preserve">. </w:t>
+      </w:r>
+      <w:hyperlink r:id="rId15">
+        <w:r>
+          <w:rPr>
+            <w:rFonts w:ascii="Cambria" w:hAnsi="Cambria" w:cs="Cambria" w:eastAsia="Cambria"/>
+            <w:sz w:val="20"/>
+            <w:color w:val="444444"/>
+          </w:rPr>
+          <w:t xml:space="preserve">https://doi.org/10.1016/j.gecco.2026.e04430</w:t>
+        </w:r>
+      </w:hyperlink>
+      <w:r>
+        <w:rPr>
+          <w:rFonts w:ascii="Cambria" w:hAnsi="Cambria" w:cs="Cambria" w:eastAsia="Cambria"/>
+          <w:b w:val="0"/>
+          <w:i w:val="0"/>
+          <w:color w:val="1F4E3D"/>
+          <w:sz w:val="18"/>
+        </w:rPr>
+        <w:t xml:space="preserve">  · SCIE</w:t>
+      </w:r>
+      <w:r>
+        <w:rPr>
+          <w:rFonts w:ascii="Cambria" w:hAnsi="Cambria" w:cs="Cambria" w:eastAsia="Cambria"/>
+          <w:b w:val="0"/>
+          <w:i w:val="0"/>
+          <w:color w:val="1F4E3D"/>
+          <w:sz w:val="18"/>
+        </w:rPr>
+        <w:t xml:space="preserve">  · IF 3.7, Q1 (2026)</w:t>
+      </w:r>
+    </w:p>
+    <w:p>
+      <w:pPr>
+        <w:spacing w:before="100"/>
+        <w:ind w:left="403" w:hanging="403"/>
+      </w:pPr>
+      <w:r>
+        <w:rPr>
+          <w:rFonts w:ascii="Cambria" w:hAnsi="Cambria" w:cs="Cambria" w:eastAsia="Cambria"/>
+          <w:b w:val="0"/>
+          <w:i w:val="0"/>
+          <w:color w:val="444444"/>
+          <w:sz w:val="20"/>
+        </w:rPr>
+        <w:t xml:space="preserve">2. </w:t>
+      </w:r>
+      <w:r>
+        <w:rPr>
+          <w:rFonts w:ascii="Cambria" w:hAnsi="Cambria" w:cs="Cambria" w:eastAsia="Cambria"/>
           <w:b/>
           <w:i w:val="0"/>
+          <w:color w:val="1A1A1A"/>
+          <w:sz w:val="20"/>
+        </w:rPr>
+        <w:t>Lee, S.</w:t>
+      </w:r>
+      <w:r>
+        <w:rPr>
+          <w:rFonts w:ascii="Cambria" w:hAnsi="Cambria" w:cs="Cambria" w:eastAsia="Cambria"/>
+          <w:b/>
+          <w:i w:val="0"/>
           <w:color w:val="1F4E3D"/>
           <w:sz w:val="20"/>
         </w:rPr>
@@ -811,7 +1007,7 @@
         </w:rPr>
         <w:t xml:space="preserve">. </w:t>
       </w:r>
-      <w:hyperlink r:id="rId15">
+      <w:hyperlink r:id="rId16">
         <w:r>
           <w:rPr>
             <w:rFonts w:ascii="Cambria" w:hAnsi="Cambria" w:cs="Cambria" w:eastAsia="Cambria"/>
@@ -855,7 +1051,7 @@
           <w:color w:val="444444"/>
           <w:sz w:val="20"/>
         </w:rPr>
-        <w:t xml:space="preserve">2. </w:t>
+        <w:t xml:space="preserve">3. </w:t>
       </w:r>
       <w:r>
         <w:rPr>
@@ -1027,7 +1223,7 @@
         </w:rPr>
         <w:t xml:space="preserve">. </w:t>
       </w:r>
-      <w:hyperlink r:id="rId16">
+      <w:hyperlink r:id="rId17">
         <w:r>
           <w:rPr>
             <w:rFonts w:ascii="Cambria" w:hAnsi="Cambria" w:cs="Cambria" w:eastAsia="Cambria"/>
@@ -1071,7 +1267,7 @@
           <w:color w:val="444444"/>
           <w:sz w:val="20"/>
         </w:rPr>
-        <w:t xml:space="preserve">3. </w:t>
+        <w:t xml:space="preserve">4. </w:t>
       </w:r>
       <w:r>
         <w:rPr>
@@ -1273,7 +1469,7 @@
         </w:rPr>
         <w:t xml:space="preserve">. </w:t>
       </w:r>
-      <w:hyperlink r:id="rId17">
+      <w:hyperlink r:id="rId18">
         <w:r>
           <w:rPr>
             <w:rFonts w:ascii="Cambria" w:hAnsi="Cambria" w:cs="Cambria" w:eastAsia="Cambria"/>
@@ -1317,7 +1513,7 @@
           <w:color w:val="444444"/>
           <w:sz w:val="20"/>
         </w:rPr>
-        <w:t xml:space="preserve">4. </w:t>
+        <w:t xml:space="preserve">5. </w:t>
       </w:r>
       <w:r>
         <w:rPr>
@@ -1549,7 +1745,7 @@
         </w:rPr>
         <w:t xml:space="preserve">. </w:t>
       </w:r>
-      <w:hyperlink r:id="rId18">
+      <w:hyperlink r:id="rId19">
         <w:r>
           <w:rPr>
             <w:rFonts w:ascii="Cambria" w:hAnsi="Cambria" w:cs="Cambria" w:eastAsia="Cambria"/>
@@ -1593,7 +1789,7 @@
           <w:color w:val="444444"/>
           <w:sz w:val="20"/>
         </w:rPr>
-        <w:t xml:space="preserve">5. </w:t>
+        <w:t xml:space="preserve">6. </w:t>
       </w:r>
       <w:r>
         <w:rPr>
@@ -1725,7 +1921,7 @@
         </w:rPr>
         <w:t xml:space="preserve">. </w:t>
       </w:r>
-      <w:hyperlink r:id="rId19">
+      <w:hyperlink r:id="rId20">
         <w:r>
           <w:rPr>
             <w:rFonts w:ascii="Cambria" w:hAnsi="Cambria" w:cs="Cambria" w:eastAsia="Cambria"/>
@@ -1769,7 +1965,7 @@
           <w:color w:val="444444"/>
           <w:sz w:val="20"/>
         </w:rPr>
-        <w:t xml:space="preserve">6. </w:t>
+        <w:t xml:space="preserve">7. </w:t>
       </w:r>
       <w:r>
         <w:rPr>
@@ -1921,7 +2117,7 @@
         </w:rPr>
         <w:t xml:space="preserve">. </w:t>
       </w:r>
-      <w:hyperlink r:id="rId20">
+      <w:hyperlink r:id="rId21">
         <w:r>
           <w:rPr>
             <w:rFonts w:ascii="Cambria" w:hAnsi="Cambria" w:cs="Cambria" w:eastAsia="Cambria"/>
@@ -1965,7 +2161,7 @@
           <w:color w:val="444444"/>
           <w:sz w:val="20"/>
         </w:rPr>
-        <w:t xml:space="preserve">7. </w:t>
+        <w:t xml:space="preserve">8. </w:t>
       </w:r>
       <w:r>
         <w:rPr>
@@ -2097,7 +2293,7 @@
         </w:rPr>
         <w:t xml:space="preserve">. </w:t>
       </w:r>
-      <w:hyperlink r:id="rId21">
+      <w:hyperlink r:id="rId22">
         <w:r>
           <w:rPr>
             <w:rFonts w:ascii="Cambria" w:hAnsi="Cambria" w:cs="Cambria" w:eastAsia="Cambria"/>
@@ -2131,7 +2327,7 @@
           <w:color w:val="444444"/>
           <w:sz w:val="20"/>
         </w:rPr>
-        <w:t xml:space="preserve">8. </w:t>
+        <w:t xml:space="preserve">9. </w:t>
       </w:r>
       <w:r>
         <w:rPr>
@@ -2303,7 +2499,7 @@
         </w:rPr>
         <w:t xml:space="preserve">. </w:t>
       </w:r>
-      <w:hyperlink r:id="rId22">
+      <w:hyperlink r:id="rId23">
         <w:r>
           <w:rPr>
             <w:rFonts w:ascii="Cambria" w:hAnsi="Cambria" w:cs="Cambria" w:eastAsia="Cambria"/>
@@ -2337,7 +2533,7 @@
           <w:color w:val="444444"/>
           <w:sz w:val="20"/>
         </w:rPr>
-        <w:t xml:space="preserve">9. </w:t>
+        <w:t xml:space="preserve">10. </w:t>
       </w:r>
       <w:r>
         <w:rPr>
@@ -2499,7 +2695,7 @@
         </w:rPr>
         <w:t xml:space="preserve">. </w:t>
       </w:r>
-      <w:hyperlink r:id="rId23">
+      <w:hyperlink r:id="rId24">
         <w:r>
           <w:rPr>
             <w:rFonts w:ascii="Cambria" w:hAnsi="Cambria" w:cs="Cambria" w:eastAsia="Cambria"/>
@@ -2533,7 +2729,7 @@
           <w:color w:val="444444"/>
           <w:sz w:val="20"/>
         </w:rPr>
-        <w:t xml:space="preserve">10. </w:t>
+        <w:t xml:space="preserve">11. </w:t>
       </w:r>
       <w:r>
         <w:rPr>
@@ -2795,7 +2991,7 @@
         </w:rPr>
         <w:t xml:space="preserve">. </w:t>
       </w:r>
-      <w:hyperlink r:id="rId24">
+      <w:hyperlink r:id="rId25">
         <w:r>
           <w:rPr>
             <w:rFonts w:ascii="Cambria" w:hAnsi="Cambria" w:cs="Cambria" w:eastAsia="Cambria"/>
@@ -2848,7 +3044,7 @@
           <w:color w:val="6F6F6F"/>
           <w:sz w:val="18"/>
         </w:rPr>
-        <w:t>APA 7th.  Name in bold = author; † = first author.  (5 manuscripts; first-author listed first)</w:t>
+        <w:t>APA 7th.  Name in bold = author; † = first author.  (3 manuscripts; first-author listed first)</w:t>
       </w:r>
     </w:p>
     <w:p>
@@ -3157,152 +3353,6 @@
           <w:sz w:val="20"/>
         </w:rPr>
         <w:t xml:space="preserve">3. </w:t>
-      </w:r>
-      <w:r>
-        <w:rPr>
-          <w:rFonts w:ascii="Cambria" w:hAnsi="Cambria" w:cs="Cambria" w:eastAsia="Cambria"/>
-          <w:b w:val="0"/>
-          <w:i w:val="0"/>
-          <w:color w:val="1A1A1A"/>
-          <w:sz w:val="20"/>
-        </w:rPr>
-        <w:t>Kim, Y.</w:t>
-      </w:r>
-      <w:r>
-        <w:rPr>
-          <w:rFonts w:ascii="Cambria" w:hAnsi="Cambria" w:cs="Cambria" w:eastAsia="Cambria"/>
-          <w:b w:val="0"/>
-          <w:i w:val="0"/>
-          <w:color w:val="1A1A1A"/>
-          <w:sz w:val="20"/>
-        </w:rPr>
-        <w:t xml:space="preserve">, </w:t>
-      </w:r>
-      <w:r>
-        <w:rPr>
-          <w:rFonts w:ascii="Cambria" w:hAnsi="Cambria" w:cs="Cambria" w:eastAsia="Cambria"/>
-          <w:b/>
-          <w:i w:val="0"/>
-          <w:color w:val="1A1A1A"/>
-          <w:sz w:val="20"/>
-        </w:rPr>
-        <w:t>Lee, S.</w:t>
-      </w:r>
-      <w:r>
-        <w:rPr>
-          <w:rFonts w:ascii="Cambria" w:hAnsi="Cambria" w:cs="Cambria" w:eastAsia="Cambria"/>
-          <w:b w:val="0"/>
-          <w:i w:val="0"/>
-          <w:color w:val="1A1A1A"/>
-          <w:sz w:val="20"/>
-        </w:rPr>
-        <w:t xml:space="preserve">, </w:t>
-      </w:r>
-      <w:r>
-        <w:rPr>
-          <w:rFonts w:ascii="Cambria" w:hAnsi="Cambria" w:cs="Cambria" w:eastAsia="Cambria"/>
-          <w:b w:val="0"/>
-          <w:i w:val="0"/>
-          <w:color w:val="1A1A1A"/>
-          <w:sz w:val="20"/>
-        </w:rPr>
-        <w:t>Shin, W.</w:t>
-      </w:r>
-      <w:r>
-        <w:rPr>
-          <w:rFonts w:ascii="Cambria" w:hAnsi="Cambria" w:cs="Cambria" w:eastAsia="Cambria"/>
-          <w:b w:val="0"/>
-          <w:i w:val="0"/>
-          <w:color w:val="1A1A1A"/>
-          <w:sz w:val="20"/>
-        </w:rPr>
-        <w:t xml:space="preserve">, </w:t>
-      </w:r>
-      <w:r>
-        <w:rPr>
-          <w:rFonts w:ascii="Cambria" w:hAnsi="Cambria" w:cs="Cambria" w:eastAsia="Cambria"/>
-          <w:b w:val="0"/>
-          <w:i w:val="0"/>
-          <w:color w:val="1A1A1A"/>
-          <w:sz w:val="20"/>
-        </w:rPr>
-        <w:t xml:space="preserve">&amp; </w:t>
-      </w:r>
-      <w:r>
-        <w:rPr>
-          <w:rFonts w:ascii="Cambria" w:hAnsi="Cambria" w:cs="Cambria" w:eastAsia="Cambria"/>
-          <w:b w:val="0"/>
-          <w:i w:val="0"/>
-          <w:color w:val="1A1A1A"/>
-          <w:sz w:val="20"/>
-        </w:rPr>
-        <w:t>Song, Y.</w:t>
-      </w:r>
-      <w:r>
-        <w:rPr>
-          <w:rFonts w:ascii="Cambria" w:hAnsi="Cambria" w:cs="Cambria" w:eastAsia="Cambria"/>
-          <w:b w:val="0"/>
-          <w:i w:val="0"/>
-          <w:color w:val="1A1A1A"/>
-          <w:sz w:val="20"/>
-        </w:rPr>
-        <w:t xml:space="preserve"> (2026). </w:t>
-      </w:r>
-      <w:r>
-        <w:rPr>
-          <w:rFonts w:ascii="Cambria" w:hAnsi="Cambria" w:cs="Cambria" w:eastAsia="Cambria"/>
-          <w:b w:val="0"/>
-          <w:i/>
-          <w:color w:val="1A1A1A"/>
-          <w:sz w:val="20"/>
-        </w:rPr>
-        <w:t>Integrating UAV-derived habitat metrics with movement persistence and species distribution models to characterize seasonal habitat use of invasive turtles in urban wetlands</w:t>
-      </w:r>
-      <w:r>
-        <w:rPr>
-          <w:rFonts w:ascii="Cambria" w:hAnsi="Cambria" w:cs="Cambria" w:eastAsia="Cambria"/>
-          <w:b w:val="0"/>
-          <w:i w:val="0"/>
-          <w:color w:val="1A1A1A"/>
-          <w:sz w:val="20"/>
-        </w:rPr>
-        <w:t xml:space="preserve"> [Revise and resubmit, 1st round]. </w:t>
-      </w:r>
-      <w:r>
-        <w:rPr>
-          <w:rFonts w:ascii="Cambria" w:hAnsi="Cambria" w:cs="Cambria" w:eastAsia="Cambria"/>
-          <w:b w:val="0"/>
-          <w:i w:val="0"/>
-          <w:color w:val="1A1A1A"/>
-          <w:sz w:val="20"/>
-        </w:rPr>
-        <w:t>Global Ecology and Conservation.</w:t>
-      </w:r>
-      <w:r>
-        <w:rPr>
-          <w:rFonts w:ascii="Cambria" w:hAnsi="Cambria" w:cs="Cambria" w:eastAsia="Cambria"/>
-          <w:b w:val="0"/>
-          <w:i w:val="0"/>
-          <w:color w:val="444444"/>
-          <w:sz w:val="18"/>
-        </w:rPr>
-        <w:t xml:space="preserve">  · May 2026</w:t>
-      </w:r>
-    </w:p>
-    <w:p>
-      <w:pPr>
-        <w:spacing w:before="100"/>
-        <w:ind w:left="403" w:hanging="403"/>
-      </w:pPr>
-      <w:r>
-        <w:rPr>
-          <w:rFonts w:ascii="Cambria" w:hAnsi="Cambria" w:cs="Cambria" w:eastAsia="Cambria"/>
-          <w:b w:val="0"/>
-          <w:i w:val="0"/>
-          <w:color w:val="444444"/>
-          <w:sz w:val="20"/>
-        </w:rPr>
-        <w:t xml:space="preserve">4. </w:t>
       </w:r>
       <w:r>
         <w:rPr>
@@ -7874,7 +7924,7 @@
         </w:rPr>
         <w:t xml:space="preserve">• </w:t>
       </w:r>
-      <w:hyperlink r:id="rId25">
+      <w:hyperlink r:id="rId26">
         <w:r>
           <w:rPr>
             <w:rFonts w:ascii="Cambria" w:hAnsi="Cambria" w:cs="Cambria" w:eastAsia="Cambria"/>
@@ -7914,7 +7964,7 @@
         </w:rPr>
         <w:t xml:space="preserve">• </w:t>
       </w:r>
-      <w:hyperlink r:id="rId26">
+      <w:hyperlink r:id="rId27">
         <w:r>
           <w:rPr>
             <w:rFonts w:ascii="Cambria" w:hAnsi="Cambria" w:cs="Cambria" w:eastAsia="Cambria"/>
@@ -7954,7 +8004,7 @@
         </w:rPr>
         <w:t xml:space="preserve">• </w:t>
       </w:r>
-      <w:hyperlink r:id="rId27">
+      <w:hyperlink r:id="rId28">
         <w:r>
           <w:rPr>
             <w:rFonts w:ascii="Cambria" w:hAnsi="Cambria" w:cs="Cambria" w:eastAsia="Cambria"/>
@@ -7994,7 +8044,7 @@
         </w:rPr>
         <w:t xml:space="preserve">• </w:t>
       </w:r>
-      <w:hyperlink r:id="rId28">
+      <w:hyperlink r:id="rId29">
         <w:r>
           <w:rPr>
             <w:rFonts w:ascii="Cambria" w:hAnsi="Cambria" w:cs="Cambria" w:eastAsia="Cambria"/>

</xml_diff>

<commit_message>
update: 심사 중 원고 정정 — 산불 GEDI 논문 저널 Science of Remote Sensing → Remote Sensing Applications: Society and Environment, 단계 Submitted · with editor (2026.09), 과제 성과 문구 동기화
Co-Authored-By: Claude Fable 5.1 <noreply@anthropic.com>
Claude-Session: https://claude.ai/code/session_01258iXENuZDnUoKxHjSqfBM
</commit_message>
<xml_diff>
--- a/cv/Lee_Seunghyeon_CV_v12.docx
+++ b/cv/Lee_Seunghyeon_CV_v12.docx
@@ -3180,17 +3180,17 @@
           <w:color w:val="1A1A1A"/>
           <w:sz w:val="20"/>
         </w:rPr>
-        <w:t xml:space="preserve"> [Manuscript under review]. </w:t>
-      </w:r>
-      <w:r>
-        <w:rPr>
-          <w:rFonts w:ascii="Cambria" w:hAnsi="Cambria" w:cs="Cambria" w:eastAsia="Cambria"/>
-          <w:b w:val="0"/>
-          <w:i w:val="0"/>
-          <w:color w:val="1A1A1A"/>
-          <w:sz w:val="20"/>
-        </w:rPr>
-        <w:t>Science of Remote Sensing.</w:t>
+        <w:t xml:space="preserve"> [Manuscript submitted (with editor)]. </w:t>
+      </w:r>
+      <w:r>
+        <w:rPr>
+          <w:rFonts w:ascii="Cambria" w:hAnsi="Cambria" w:cs="Cambria" w:eastAsia="Cambria"/>
+          <w:b w:val="0"/>
+          <w:i w:val="0"/>
+          <w:color w:val="1A1A1A"/>
+          <w:sz w:val="20"/>
+        </w:rPr>
+        <w:t>Remote Sensing Applications: Society and Environment.</w:t>
       </w:r>
       <w:r>
         <w:rPr>
@@ -3200,7 +3200,7 @@
           <w:color w:val="444444"/>
           <w:sz w:val="18"/>
         </w:rPr>
-        <w:t xml:space="preserve">  · Apr 2026</w:t>
+        <w:t xml:space="preserve">  · Sep 2026</w:t>
       </w:r>
     </w:p>
     <w:p>
@@ -5707,7 +5707,7 @@
           <w:color w:val="444444"/>
           <w:sz w:val="18"/>
         </w:rPr>
-        <w:t>Multi-scale forest typologies (Ecological Indicators 2026, first author); post-fire structural loss via spaceborne LiDAR (Science of Remote Sensing, under review); coastal-wetland Phragmites–Suaeda monitoring (Journal of Coastal Conservation, under review); AGU &amp; ESA presentations</w:t>
+        <w:t>Multi-scale forest typologies (Ecological Indicators 2026, first author); post-fire structural loss via spaceborne LiDAR (Remote Sensing Applications: Society and Environment, submitted); coastal-wetland Phragmites–Suaeda monitoring (Journal of Coastal Conservation, under review); AGU &amp; ESA presentations</w:t>
       </w:r>
     </w:p>
     <w:p>

</xml_diff>